<commit_message>
Clean up final project artifacts
</commit_message>
<xml_diff>
--- a/DS529-Final-Project Report.docx
+++ b/DS529-Final-Project Report.docx
@@ -62,7 +62,7 @@
         <w:t>02</w:t>
       </w:r>
       <w:r>
-        <w:t xml:space="preserve">. The objective is to predict the weekly stream counts for the selected songs for the week of 2024-12-19. Below, </w:t>
+        <w:t xml:space="preserve">. The objective is to predict the weekly stream counts for the selected songs for the forecast date of 2025-01-03. Below, </w:t>
       </w:r>
       <w:r>
         <w:t>we</w:t>
@@ -357,7 +357,15 @@
         <w:pStyle w:val="NormalWeb"/>
       </w:pPr>
       <w:r>
-        <w:t>We applied 8 models to our data. We have detailed these models below. We used r2, mae, mse metrics to measure the significance of the models. The way we used these metrics is as follows: we predicted the week before the week we wanted to predict with 8 different models for each song. We applied the model with the lowest mse to the week we actually wanted to predict. At first, we applied these models by including genre and duration in the data, but the MSEs were extremely high and the models were almost meaningless. Therefore, we set up models only according to the number of streams. These produced more meaningful results. The models and equations set up are given below.</w:t>
+        <w:t>Metric note: MAE and MSE are unavailable for two forecast rows where the submitted output does not contain a comparison actual value. These cells are intentionally left blank in the forecast workbook and documented in the Notes sheet.</w:t>
+      </w:r>
+    </w:p>
+    <w:p>
+      <w:pPr>
+        <w:pStyle w:val="NormalWeb"/>
+      </w:pPr>
+      <w:r>
+        <w:t>We applied 8 models to our data. We have detailed these models below. We used R2, MAE, and MSE metrics to measure the significance of the models. The way we used these metrics is as follows: we predicted the week before the week we wanted to predict with 8 different models for each song. We applied the model with the lowest mse to the week we actually wanted to predict. At first, we applied these models by including genre and duration in the data, but the MSEs were extremely high and the models were almost meaningless. Therefore, we set up models only according to the number of streams. These produced more meaningful results. The models and equations set up are given below.</w:t>
       </w:r>
     </w:p>
     <w:p>

</xml_diff>